<commit_message>
Fix thesis proposal footer page alignment
Co-authored-by: IdrisBaks <IdrisBaks@users.noreply.github.com>
</commit_message>
<xml_diff>
--- a/PerspectiveArchive_Thesis_Proposal.docx
+++ b/PerspectiveArchive_Thesis_Proposal.docx
@@ -14758,6 +14758,10 @@
 <file path=word/footer1.xml><?xml version="1.0" encoding="utf-8"?>
 <w:ftr xmlns:m="http://schemas.openxmlformats.org/officeDocument/2006/math" xmlns:mc="http://schemas.openxmlformats.org/markup-compatibility/2006" xmlns:mo="http://schemas.microsoft.com/office/mac/office/2008/main" xmlns:mv="urn:schemas-microsoft-com:mac:vml" xmlns:o="urn:schemas-microsoft-com:office:office" xmlns:r="http://schemas.openxmlformats.org/officeDocument/2006/relationships" xmlns:v="urn:schemas-microsoft-com:vml" xmlns:w10="urn:schemas-microsoft-com:office:word" xmlns:w14="http://schemas.microsoft.com/office/word/2010/wordml" xmlns:w="http://schemas.openxmlformats.org/wordprocessingml/2006/main" xmlns:wne="http://schemas.microsoft.com/office/word/2006/wordml" xmlns:wp14="http://schemas.microsoft.com/office/word/2010/wordprocessingDrawing" xmlns:wp="http://schemas.openxmlformats.org/drawingml/2006/wordprocessingDrawing" xmlns:wpc="http://schemas.microsoft.com/office/word/2010/wordprocessingCanvas" xmlns:wpg="http://schemas.microsoft.com/office/word/2010/wordprocessingGroup" xmlns:wpi="http://schemas.microsoft.com/office/word/2010/wordprocessingInk" xmlns:wps="http://schemas.microsoft.com/office/word/2010/wordprocessingShape" mc:Ignorable="w14 wp14">
   <w:p>
+    <w:pPr>
+      <w:spacing w:after="0" w:line="360" w:lineRule="auto"/>
+      <w:jc w:val="right"/>
+    </w:pPr>
     <w:r>
       <w:rPr>
         <w:rFonts w:ascii="Times New Roman" w:hAnsi="Times New Roman" w:eastAsia="Times New Roman"/>
@@ -14776,6 +14780,10 @@
 <file path=word/footer2.xml><?xml version="1.0" encoding="utf-8"?>
 <w:ftr xmlns:m="http://schemas.openxmlformats.org/officeDocument/2006/math" xmlns:mc="http://schemas.openxmlformats.org/markup-compatibility/2006" xmlns:mo="http://schemas.microsoft.com/office/mac/office/2008/main" xmlns:mv="urn:schemas-microsoft-com:mac:vml" xmlns:o="urn:schemas-microsoft-com:office:office" xmlns:r="http://schemas.openxmlformats.org/officeDocument/2006/relationships" xmlns:v="urn:schemas-microsoft-com:vml" xmlns:w10="urn:schemas-microsoft-com:office:word" xmlns:w14="http://schemas.microsoft.com/office/word/2010/wordml" xmlns:w="http://schemas.openxmlformats.org/wordprocessingml/2006/main" xmlns:wne="http://schemas.microsoft.com/office/word/2006/wordml" xmlns:wp14="http://schemas.microsoft.com/office/word/2010/wordprocessingDrawing" xmlns:wp="http://schemas.openxmlformats.org/drawingml/2006/wordprocessingDrawing" xmlns:wpc="http://schemas.microsoft.com/office/word/2010/wordprocessingCanvas" xmlns:wpg="http://schemas.microsoft.com/office/word/2010/wordprocessingGroup" xmlns:wpi="http://schemas.microsoft.com/office/word/2010/wordprocessingInk" xmlns:wps="http://schemas.microsoft.com/office/word/2010/wordprocessingShape" mc:Ignorable="w14 wp14">
   <w:p>
+    <w:pPr>
+      <w:spacing w:after="0" w:line="360" w:lineRule="auto"/>
+      <w:jc w:val="right"/>
+    </w:pPr>
     <w:r>
       <w:rPr>
         <w:rFonts w:ascii="Times New Roman" w:hAnsi="Times New Roman" w:eastAsia="Times New Roman"/>

</xml_diff>

<commit_message>
Make thesis proposal TOC visible
Co-authored-by: IdrisBaks <IdrisBaks@users.noreply.github.com>
</commit_message>
<xml_diff>
--- a/PerspectiveArchive_Thesis_Proposal.docx
+++ b/PerspectiveArchive_Thesis_Proposal.docx
@@ -408,32 +408,826 @@
     </w:p>
     <w:p>
       <w:pPr>
+        <w:tabs>
+          <w:tab w:pos="8640" w:val="right" w:leader="dot"/>
+        </w:tabs>
         <w:spacing w:line="360" w:lineRule="auto" w:after="0"/>
-        <w:jc w:val="both"/>
+        <w:ind w:left="0"/>
+        <w:jc w:val="left"/>
       </w:pPr>
       <w:r>
         <w:rPr>
           <w:rFonts w:ascii="Times New Roman" w:hAnsi="Times New Roman" w:eastAsia="Times New Roman"/>
+          <w:b/>
           <w:sz w:val="24"/>
         </w:rPr>
-        <w:fldChar w:fldCharType="begin"/>
-        <w:instrText xml:space="preserve">TOC \o "1-3" \h \z \u</w:instrText>
-        <w:fldChar w:fldCharType="separate"/>
-        <w:t>Table of Contents - update field in Word if page numbers are not shown automatically.</w:t>
-        <w:fldChar w:fldCharType="end"/>
+        <w:t>Title Page</w:t>
+      </w:r>
+      <w:r>
+        <w:rPr>
+          <w:rFonts w:ascii="Times New Roman" w:hAnsi="Times New Roman" w:eastAsia="Times New Roman"/>
+          <w:b/>
+          <w:sz w:val="24"/>
+        </w:rPr>
+        <w:tab/>
+        <w:t>i</w:t>
       </w:r>
     </w:p>
     <w:p>
       <w:pPr>
-        <w:spacing w:line="360" w:lineRule="auto"/>
-        <w:jc w:val="both"/>
+        <w:tabs>
+          <w:tab w:pos="8640" w:val="right" w:leader="dot"/>
+        </w:tabs>
+        <w:spacing w:line="360" w:lineRule="auto" w:after="0"/>
+        <w:ind w:left="0"/>
+        <w:jc w:val="left"/>
       </w:pPr>
       <w:r>
         <w:rPr>
           <w:rFonts w:ascii="Times New Roman" w:hAnsi="Times New Roman" w:eastAsia="Times New Roman"/>
+          <w:b/>
           <w:sz w:val="24"/>
         </w:rPr>
-        <w:br w:type="page"/>
+        <w:t>Table of Contents</w:t>
+      </w:r>
+      <w:r>
+        <w:rPr>
+          <w:rFonts w:ascii="Times New Roman" w:hAnsi="Times New Roman" w:eastAsia="Times New Roman"/>
+          <w:b/>
+          <w:sz w:val="24"/>
+        </w:rPr>
+        <w:tab/>
+        <w:t>ii</w:t>
+      </w:r>
+    </w:p>
+    <w:p>
+      <w:pPr>
+        <w:tabs>
+          <w:tab w:pos="8640" w:val="right" w:leader="dot"/>
+        </w:tabs>
+        <w:spacing w:line="360" w:lineRule="auto" w:after="0"/>
+        <w:ind w:left="0"/>
+        <w:jc w:val="left"/>
+      </w:pPr>
+      <w:r>
+        <w:rPr>
+          <w:rFonts w:ascii="Times New Roman" w:hAnsi="Times New Roman" w:eastAsia="Times New Roman"/>
+          <w:b/>
+          <w:sz w:val="24"/>
+        </w:rPr>
+        <w:t>List of Tables</w:t>
+      </w:r>
+      <w:r>
+        <w:rPr>
+          <w:rFonts w:ascii="Times New Roman" w:hAnsi="Times New Roman" w:eastAsia="Times New Roman"/>
+          <w:b/>
+          <w:sz w:val="24"/>
+        </w:rPr>
+        <w:tab/>
+        <w:t>iii</w:t>
+      </w:r>
+    </w:p>
+    <w:p>
+      <w:pPr>
+        <w:tabs>
+          <w:tab w:pos="8640" w:val="right" w:leader="dot"/>
+        </w:tabs>
+        <w:spacing w:line="360" w:lineRule="auto" w:after="0"/>
+        <w:ind w:left="0"/>
+        <w:jc w:val="left"/>
+      </w:pPr>
+      <w:r>
+        <w:rPr>
+          <w:rFonts w:ascii="Times New Roman" w:hAnsi="Times New Roman" w:eastAsia="Times New Roman"/>
+          <w:b/>
+          <w:sz w:val="24"/>
+        </w:rPr>
+        <w:t>List of Figures</w:t>
+      </w:r>
+      <w:r>
+        <w:rPr>
+          <w:rFonts w:ascii="Times New Roman" w:hAnsi="Times New Roman" w:eastAsia="Times New Roman"/>
+          <w:b/>
+          <w:sz w:val="24"/>
+        </w:rPr>
+        <w:tab/>
+        <w:t>iv</w:t>
+      </w:r>
+    </w:p>
+    <w:p>
+      <w:pPr>
+        <w:tabs>
+          <w:tab w:pos="8640" w:val="right" w:leader="dot"/>
+        </w:tabs>
+        <w:spacing w:line="360" w:lineRule="auto" w:after="0"/>
+        <w:ind w:left="0"/>
+        <w:jc w:val="left"/>
+      </w:pPr>
+      <w:r>
+        <w:rPr>
+          <w:rFonts w:ascii="Times New Roman" w:hAnsi="Times New Roman" w:eastAsia="Times New Roman"/>
+          <w:b/>
+          <w:sz w:val="24"/>
+        </w:rPr>
+        <w:t>List of Appendices</w:t>
+      </w:r>
+      <w:r>
+        <w:rPr>
+          <w:rFonts w:ascii="Times New Roman" w:hAnsi="Times New Roman" w:eastAsia="Times New Roman"/>
+          <w:b/>
+          <w:sz w:val="24"/>
+        </w:rPr>
+        <w:tab/>
+        <w:t>v</w:t>
+      </w:r>
+    </w:p>
+    <w:p>
+      <w:pPr>
+        <w:tabs>
+          <w:tab w:pos="8640" w:val="right" w:leader="dot"/>
+        </w:tabs>
+        <w:spacing w:line="360" w:lineRule="auto" w:after="0"/>
+        <w:ind w:left="0"/>
+        <w:jc w:val="left"/>
+      </w:pPr>
+      <w:r>
+        <w:rPr>
+          <w:rFonts w:ascii="Times New Roman" w:hAnsi="Times New Roman" w:eastAsia="Times New Roman"/>
+          <w:b/>
+          <w:sz w:val="24"/>
+        </w:rPr>
+        <w:t>CHAPTER 1 - INTRODUCTION</w:t>
+      </w:r>
+      <w:r>
+        <w:rPr>
+          <w:rFonts w:ascii="Times New Roman" w:hAnsi="Times New Roman" w:eastAsia="Times New Roman"/>
+          <w:b/>
+          <w:sz w:val="24"/>
+        </w:rPr>
+        <w:tab/>
+        <w:t>1</w:t>
+      </w:r>
+    </w:p>
+    <w:p>
+      <w:pPr>
+        <w:tabs>
+          <w:tab w:pos="8640" w:val="right" w:leader="dot"/>
+        </w:tabs>
+        <w:spacing w:line="360" w:lineRule="auto" w:after="0"/>
+        <w:ind w:left="432"/>
+        <w:jc w:val="left"/>
+      </w:pPr>
+      <w:r>
+        <w:rPr>
+          <w:rFonts w:ascii="Times New Roman" w:hAnsi="Times New Roman" w:eastAsia="Times New Roman"/>
+          <w:b w:val="0"/>
+          <w:sz w:val="24"/>
+        </w:rPr>
+        <w:t>Background of the Study</w:t>
+      </w:r>
+      <w:r>
+        <w:rPr>
+          <w:rFonts w:ascii="Times New Roman" w:hAnsi="Times New Roman" w:eastAsia="Times New Roman"/>
+          <w:b w:val="0"/>
+          <w:sz w:val="24"/>
+        </w:rPr>
+        <w:tab/>
+        <w:t>1</w:t>
+      </w:r>
+    </w:p>
+    <w:p>
+      <w:pPr>
+        <w:tabs>
+          <w:tab w:pos="8640" w:val="right" w:leader="dot"/>
+        </w:tabs>
+        <w:spacing w:line="360" w:lineRule="auto" w:after="0"/>
+        <w:ind w:left="432"/>
+        <w:jc w:val="left"/>
+      </w:pPr>
+      <w:r>
+        <w:rPr>
+          <w:rFonts w:ascii="Times New Roman" w:hAnsi="Times New Roman" w:eastAsia="Times New Roman"/>
+          <w:b w:val="0"/>
+          <w:sz w:val="24"/>
+        </w:rPr>
+        <w:t>Statement of the Problem</w:t>
+      </w:r>
+      <w:r>
+        <w:rPr>
+          <w:rFonts w:ascii="Times New Roman" w:hAnsi="Times New Roman" w:eastAsia="Times New Roman"/>
+          <w:b w:val="0"/>
+          <w:sz w:val="24"/>
+        </w:rPr>
+        <w:tab/>
+        <w:t>1</w:t>
+      </w:r>
+    </w:p>
+    <w:p>
+      <w:pPr>
+        <w:tabs>
+          <w:tab w:pos="8640" w:val="right" w:leader="dot"/>
+        </w:tabs>
+        <w:spacing w:line="360" w:lineRule="auto" w:after="0"/>
+        <w:ind w:left="432"/>
+        <w:jc w:val="left"/>
+      </w:pPr>
+      <w:r>
+        <w:rPr>
+          <w:rFonts w:ascii="Times New Roman" w:hAnsi="Times New Roman" w:eastAsia="Times New Roman"/>
+          <w:b w:val="0"/>
+          <w:sz w:val="24"/>
+        </w:rPr>
+        <w:t>Objectives of the Study</w:t>
+      </w:r>
+      <w:r>
+        <w:rPr>
+          <w:rFonts w:ascii="Times New Roman" w:hAnsi="Times New Roman" w:eastAsia="Times New Roman"/>
+          <w:b w:val="0"/>
+          <w:sz w:val="24"/>
+        </w:rPr>
+        <w:tab/>
+        <w:t>2</w:t>
+      </w:r>
+    </w:p>
+    <w:p>
+      <w:pPr>
+        <w:tabs>
+          <w:tab w:pos="8640" w:val="right" w:leader="dot"/>
+        </w:tabs>
+        <w:spacing w:line="360" w:lineRule="auto" w:after="0"/>
+        <w:ind w:left="432"/>
+        <w:jc w:val="left"/>
+      </w:pPr>
+      <w:r>
+        <w:rPr>
+          <w:rFonts w:ascii="Times New Roman" w:hAnsi="Times New Roman" w:eastAsia="Times New Roman"/>
+          <w:b w:val="0"/>
+          <w:sz w:val="24"/>
+        </w:rPr>
+        <w:t>Scope and Limitations</w:t>
+      </w:r>
+      <w:r>
+        <w:rPr>
+          <w:rFonts w:ascii="Times New Roman" w:hAnsi="Times New Roman" w:eastAsia="Times New Roman"/>
+          <w:b w:val="0"/>
+          <w:sz w:val="24"/>
+        </w:rPr>
+        <w:tab/>
+        <w:t>2</w:t>
+      </w:r>
+    </w:p>
+    <w:p>
+      <w:pPr>
+        <w:tabs>
+          <w:tab w:pos="8640" w:val="right" w:leader="dot"/>
+        </w:tabs>
+        <w:spacing w:line="360" w:lineRule="auto" w:after="0"/>
+        <w:ind w:left="432"/>
+        <w:jc w:val="left"/>
+      </w:pPr>
+      <w:r>
+        <w:rPr>
+          <w:rFonts w:ascii="Times New Roman" w:hAnsi="Times New Roman" w:eastAsia="Times New Roman"/>
+          <w:b w:val="0"/>
+          <w:sz w:val="24"/>
+        </w:rPr>
+        <w:t>Significance of the Study</w:t>
+      </w:r>
+      <w:r>
+        <w:rPr>
+          <w:rFonts w:ascii="Times New Roman" w:hAnsi="Times New Roman" w:eastAsia="Times New Roman"/>
+          <w:b w:val="0"/>
+          <w:sz w:val="24"/>
+        </w:rPr>
+        <w:tab/>
+        <w:t>3</w:t>
+      </w:r>
+    </w:p>
+    <w:p>
+      <w:pPr>
+        <w:tabs>
+          <w:tab w:pos="8640" w:val="right" w:leader="dot"/>
+        </w:tabs>
+        <w:spacing w:line="360" w:lineRule="auto" w:after="0"/>
+        <w:ind w:left="432"/>
+        <w:jc w:val="left"/>
+      </w:pPr>
+      <w:r>
+        <w:rPr>
+          <w:rFonts w:ascii="Times New Roman" w:hAnsi="Times New Roman" w:eastAsia="Times New Roman"/>
+          <w:b w:val="0"/>
+          <w:sz w:val="24"/>
+        </w:rPr>
+        <w:t>Definition of Terms</w:t>
+      </w:r>
+      <w:r>
+        <w:rPr>
+          <w:rFonts w:ascii="Times New Roman" w:hAnsi="Times New Roman" w:eastAsia="Times New Roman"/>
+          <w:b w:val="0"/>
+          <w:sz w:val="24"/>
+        </w:rPr>
+        <w:tab/>
+        <w:t>3</w:t>
+      </w:r>
+    </w:p>
+    <w:p>
+      <w:pPr>
+        <w:tabs>
+          <w:tab w:pos="8640" w:val="right" w:leader="dot"/>
+        </w:tabs>
+        <w:spacing w:line="360" w:lineRule="auto" w:after="0"/>
+        <w:ind w:left="0"/>
+        <w:jc w:val="left"/>
+      </w:pPr>
+      <w:r>
+        <w:rPr>
+          <w:rFonts w:ascii="Times New Roman" w:hAnsi="Times New Roman" w:eastAsia="Times New Roman"/>
+          <w:b/>
+          <w:sz w:val="24"/>
+        </w:rPr>
+        <w:t>CHAPTER 2 - CONCEPTUAL FRAMEWORK</w:t>
+      </w:r>
+      <w:r>
+        <w:rPr>
+          <w:rFonts w:ascii="Times New Roman" w:hAnsi="Times New Roman" w:eastAsia="Times New Roman"/>
+          <w:b/>
+          <w:sz w:val="24"/>
+        </w:rPr>
+        <w:tab/>
+        <w:t>4</w:t>
+      </w:r>
+    </w:p>
+    <w:p>
+      <w:pPr>
+        <w:tabs>
+          <w:tab w:pos="8640" w:val="right" w:leader="dot"/>
+        </w:tabs>
+        <w:spacing w:line="360" w:lineRule="auto" w:after="0"/>
+        <w:ind w:left="432"/>
+        <w:jc w:val="left"/>
+      </w:pPr>
+      <w:r>
+        <w:rPr>
+          <w:rFonts w:ascii="Times New Roman" w:hAnsi="Times New Roman" w:eastAsia="Times New Roman"/>
+          <w:b w:val="0"/>
+          <w:sz w:val="24"/>
+        </w:rPr>
+        <w:t>Conceptual Framework</w:t>
+      </w:r>
+      <w:r>
+        <w:rPr>
+          <w:rFonts w:ascii="Times New Roman" w:hAnsi="Times New Roman" w:eastAsia="Times New Roman"/>
+          <w:b w:val="0"/>
+          <w:sz w:val="24"/>
+        </w:rPr>
+        <w:tab/>
+        <w:t>4</w:t>
+      </w:r>
+    </w:p>
+    <w:p>
+      <w:pPr>
+        <w:tabs>
+          <w:tab w:pos="8640" w:val="right" w:leader="dot"/>
+        </w:tabs>
+        <w:spacing w:line="360" w:lineRule="auto" w:after="0"/>
+        <w:ind w:left="432"/>
+        <w:jc w:val="left"/>
+      </w:pPr>
+      <w:r>
+        <w:rPr>
+          <w:rFonts w:ascii="Times New Roman" w:hAnsi="Times New Roman" w:eastAsia="Times New Roman"/>
+          <w:b w:val="0"/>
+          <w:sz w:val="24"/>
+        </w:rPr>
+        <w:t>Theoretical and Conceptual Bases</w:t>
+      </w:r>
+      <w:r>
+        <w:rPr>
+          <w:rFonts w:ascii="Times New Roman" w:hAnsi="Times New Roman" w:eastAsia="Times New Roman"/>
+          <w:b w:val="0"/>
+          <w:sz w:val="24"/>
+        </w:rPr>
+        <w:tab/>
+        <w:t>5</w:t>
+      </w:r>
+    </w:p>
+    <w:p>
+      <w:pPr>
+        <w:tabs>
+          <w:tab w:pos="8640" w:val="right" w:leader="dot"/>
+        </w:tabs>
+        <w:spacing w:line="360" w:lineRule="auto" w:after="0"/>
+        <w:ind w:left="0"/>
+        <w:jc w:val="left"/>
+      </w:pPr>
+      <w:r>
+        <w:rPr>
+          <w:rFonts w:ascii="Times New Roman" w:hAnsi="Times New Roman" w:eastAsia="Times New Roman"/>
+          <w:b/>
+          <w:sz w:val="24"/>
+        </w:rPr>
+        <w:t>CHAPTER 3 - RESEARCH METHODOLOGY</w:t>
+      </w:r>
+      <w:r>
+        <w:rPr>
+          <w:rFonts w:ascii="Times New Roman" w:hAnsi="Times New Roman" w:eastAsia="Times New Roman"/>
+          <w:b/>
+          <w:sz w:val="24"/>
+        </w:rPr>
+        <w:tab/>
+        <w:t>6</w:t>
+      </w:r>
+    </w:p>
+    <w:p>
+      <w:pPr>
+        <w:tabs>
+          <w:tab w:pos="8640" w:val="right" w:leader="dot"/>
+        </w:tabs>
+        <w:spacing w:line="360" w:lineRule="auto" w:after="0"/>
+        <w:ind w:left="432"/>
+        <w:jc w:val="left"/>
+      </w:pPr>
+      <w:r>
+        <w:rPr>
+          <w:rFonts w:ascii="Times New Roman" w:hAnsi="Times New Roman" w:eastAsia="Times New Roman"/>
+          <w:b w:val="0"/>
+          <w:sz w:val="24"/>
+        </w:rPr>
+        <w:t>3.1 Research Design</w:t>
+      </w:r>
+      <w:r>
+        <w:rPr>
+          <w:rFonts w:ascii="Times New Roman" w:hAnsi="Times New Roman" w:eastAsia="Times New Roman"/>
+          <w:b w:val="0"/>
+          <w:sz w:val="24"/>
+        </w:rPr>
+        <w:tab/>
+        <w:t>6</w:t>
+      </w:r>
+    </w:p>
+    <w:p>
+      <w:pPr>
+        <w:tabs>
+          <w:tab w:pos="8640" w:val="right" w:leader="dot"/>
+        </w:tabs>
+        <w:spacing w:line="360" w:lineRule="auto" w:after="0"/>
+        <w:ind w:left="432"/>
+        <w:jc w:val="left"/>
+      </w:pPr>
+      <w:r>
+        <w:rPr>
+          <w:rFonts w:ascii="Times New Roman" w:hAnsi="Times New Roman" w:eastAsia="Times New Roman"/>
+          <w:b w:val="0"/>
+          <w:sz w:val="24"/>
+        </w:rPr>
+        <w:t>3.2 System Development Model</w:t>
+      </w:r>
+      <w:r>
+        <w:rPr>
+          <w:rFonts w:ascii="Times New Roman" w:hAnsi="Times New Roman" w:eastAsia="Times New Roman"/>
+          <w:b w:val="0"/>
+          <w:sz w:val="24"/>
+        </w:rPr>
+        <w:tab/>
+        <w:t>7</w:t>
+      </w:r>
+    </w:p>
+    <w:p>
+      <w:pPr>
+        <w:tabs>
+          <w:tab w:pos="8640" w:val="right" w:leader="dot"/>
+        </w:tabs>
+        <w:spacing w:line="360" w:lineRule="auto" w:after="0"/>
+        <w:ind w:left="432"/>
+        <w:jc w:val="left"/>
+      </w:pPr>
+      <w:r>
+        <w:rPr>
+          <w:rFonts w:ascii="Times New Roman" w:hAnsi="Times New Roman" w:eastAsia="Times New Roman"/>
+          <w:b w:val="0"/>
+          <w:sz w:val="24"/>
+        </w:rPr>
+        <w:t>3.3 System Architecture</w:t>
+      </w:r>
+      <w:r>
+        <w:rPr>
+          <w:rFonts w:ascii="Times New Roman" w:hAnsi="Times New Roman" w:eastAsia="Times New Roman"/>
+          <w:b w:val="0"/>
+          <w:sz w:val="24"/>
+        </w:rPr>
+        <w:tab/>
+        <w:t>8</w:t>
+      </w:r>
+    </w:p>
+    <w:p>
+      <w:pPr>
+        <w:tabs>
+          <w:tab w:pos="8640" w:val="right" w:leader="dot"/>
+        </w:tabs>
+        <w:spacing w:line="360" w:lineRule="auto" w:after="0"/>
+        <w:ind w:left="432"/>
+        <w:jc w:val="left"/>
+      </w:pPr>
+      <w:r>
+        <w:rPr>
+          <w:rFonts w:ascii="Times New Roman" w:hAnsi="Times New Roman" w:eastAsia="Times New Roman"/>
+          <w:b w:val="0"/>
+          <w:sz w:val="24"/>
+        </w:rPr>
+        <w:t>3.4 Technology Stack</w:t>
+      </w:r>
+      <w:r>
+        <w:rPr>
+          <w:rFonts w:ascii="Times New Roman" w:hAnsi="Times New Roman" w:eastAsia="Times New Roman"/>
+          <w:b w:val="0"/>
+          <w:sz w:val="24"/>
+        </w:rPr>
+        <w:tab/>
+        <w:t>10</w:t>
+      </w:r>
+    </w:p>
+    <w:p>
+      <w:pPr>
+        <w:tabs>
+          <w:tab w:pos="8640" w:val="right" w:leader="dot"/>
+        </w:tabs>
+        <w:spacing w:line="360" w:lineRule="auto" w:after="0"/>
+        <w:ind w:left="432"/>
+        <w:jc w:val="left"/>
+      </w:pPr>
+      <w:r>
+        <w:rPr>
+          <w:rFonts w:ascii="Times New Roman" w:hAnsi="Times New Roman" w:eastAsia="Times New Roman"/>
+          <w:b w:val="0"/>
+          <w:sz w:val="24"/>
+        </w:rPr>
+        <w:t>3.5 Respondents and Participants</w:t>
+      </w:r>
+      <w:r>
+        <w:rPr>
+          <w:rFonts w:ascii="Times New Roman" w:hAnsi="Times New Roman" w:eastAsia="Times New Roman"/>
+          <w:b w:val="0"/>
+          <w:sz w:val="24"/>
+        </w:rPr>
+        <w:tab/>
+        <w:t>11</w:t>
+      </w:r>
+    </w:p>
+    <w:p>
+      <w:pPr>
+        <w:tabs>
+          <w:tab w:pos="8640" w:val="right" w:leader="dot"/>
+        </w:tabs>
+        <w:spacing w:line="360" w:lineRule="auto" w:after="0"/>
+        <w:ind w:left="432"/>
+        <w:jc w:val="left"/>
+      </w:pPr>
+      <w:r>
+        <w:rPr>
+          <w:rFonts w:ascii="Times New Roman" w:hAnsi="Times New Roman" w:eastAsia="Times New Roman"/>
+          <w:b w:val="0"/>
+          <w:sz w:val="24"/>
+        </w:rPr>
+        <w:t>3.6 Data Collection Instruments</w:t>
+      </w:r>
+      <w:r>
+        <w:rPr>
+          <w:rFonts w:ascii="Times New Roman" w:hAnsi="Times New Roman" w:eastAsia="Times New Roman"/>
+          <w:b w:val="0"/>
+          <w:sz w:val="24"/>
+        </w:rPr>
+        <w:tab/>
+        <w:t>12</w:t>
+      </w:r>
+    </w:p>
+    <w:p>
+      <w:pPr>
+        <w:tabs>
+          <w:tab w:pos="8640" w:val="right" w:leader="dot"/>
+        </w:tabs>
+        <w:spacing w:line="360" w:lineRule="auto" w:after="0"/>
+        <w:ind w:left="432"/>
+        <w:jc w:val="left"/>
+      </w:pPr>
+      <w:r>
+        <w:rPr>
+          <w:rFonts w:ascii="Times New Roman" w:hAnsi="Times New Roman" w:eastAsia="Times New Roman"/>
+          <w:b w:val="0"/>
+          <w:sz w:val="24"/>
+        </w:rPr>
+        <w:t>3.7 Data Collection Procedure</w:t>
+      </w:r>
+      <w:r>
+        <w:rPr>
+          <w:rFonts w:ascii="Times New Roman" w:hAnsi="Times New Roman" w:eastAsia="Times New Roman"/>
+          <w:b w:val="0"/>
+          <w:sz w:val="24"/>
+        </w:rPr>
+        <w:tab/>
+        <w:t>14</w:t>
+      </w:r>
+    </w:p>
+    <w:p>
+      <w:pPr>
+        <w:tabs>
+          <w:tab w:pos="8640" w:val="right" w:leader="dot"/>
+        </w:tabs>
+        <w:spacing w:line="360" w:lineRule="auto" w:after="0"/>
+        <w:ind w:left="432"/>
+        <w:jc w:val="left"/>
+      </w:pPr>
+      <w:r>
+        <w:rPr>
+          <w:rFonts w:ascii="Times New Roman" w:hAnsi="Times New Roman" w:eastAsia="Times New Roman"/>
+          <w:b w:val="0"/>
+          <w:sz w:val="24"/>
+        </w:rPr>
+        <w:t>3.8 Data Analysis</w:t>
+      </w:r>
+      <w:r>
+        <w:rPr>
+          <w:rFonts w:ascii="Times New Roman" w:hAnsi="Times New Roman" w:eastAsia="Times New Roman"/>
+          <w:b w:val="0"/>
+          <w:sz w:val="24"/>
+        </w:rPr>
+        <w:tab/>
+        <w:t>15</w:t>
+      </w:r>
+    </w:p>
+    <w:p>
+      <w:pPr>
+        <w:tabs>
+          <w:tab w:pos="8640" w:val="right" w:leader="dot"/>
+        </w:tabs>
+        <w:spacing w:line="360" w:lineRule="auto" w:after="0"/>
+        <w:ind w:left="432"/>
+        <w:jc w:val="left"/>
+      </w:pPr>
+      <w:r>
+        <w:rPr>
+          <w:rFonts w:ascii="Times New Roman" w:hAnsi="Times New Roman" w:eastAsia="Times New Roman"/>
+          <w:b w:val="0"/>
+          <w:sz w:val="24"/>
+        </w:rPr>
+        <w:t>3.9 Ethical Considerations</w:t>
+      </w:r>
+      <w:r>
+        <w:rPr>
+          <w:rFonts w:ascii="Times New Roman" w:hAnsi="Times New Roman" w:eastAsia="Times New Roman"/>
+          <w:b w:val="0"/>
+          <w:sz w:val="24"/>
+        </w:rPr>
+        <w:tab/>
+        <w:t>16</w:t>
+      </w:r>
+    </w:p>
+    <w:p>
+      <w:pPr>
+        <w:tabs>
+          <w:tab w:pos="8640" w:val="right" w:leader="dot"/>
+        </w:tabs>
+        <w:spacing w:line="360" w:lineRule="auto" w:after="0"/>
+        <w:ind w:left="432"/>
+        <w:jc w:val="left"/>
+      </w:pPr>
+      <w:r>
+        <w:rPr>
+          <w:rFonts w:ascii="Times New Roman" w:hAnsi="Times New Roman" w:eastAsia="Times New Roman"/>
+          <w:b w:val="0"/>
+          <w:sz w:val="24"/>
+        </w:rPr>
+        <w:t>3.10 Scope and Limitations of the Methodology</w:t>
+      </w:r>
+      <w:r>
+        <w:rPr>
+          <w:rFonts w:ascii="Times New Roman" w:hAnsi="Times New Roman" w:eastAsia="Times New Roman"/>
+          <w:b w:val="0"/>
+          <w:sz w:val="24"/>
+        </w:rPr>
+        <w:tab/>
+        <w:t>17</w:t>
+      </w:r>
+    </w:p>
+    <w:p>
+      <w:pPr>
+        <w:tabs>
+          <w:tab w:pos="8640" w:val="right" w:leader="dot"/>
+        </w:tabs>
+        <w:spacing w:line="360" w:lineRule="auto" w:after="0"/>
+        <w:ind w:left="0"/>
+        <w:jc w:val="left"/>
+      </w:pPr>
+      <w:r>
+        <w:rPr>
+          <w:rFonts w:ascii="Times New Roman" w:hAnsi="Times New Roman" w:eastAsia="Times New Roman"/>
+          <w:b/>
+          <w:sz w:val="24"/>
+        </w:rPr>
+        <w:t>REFERENCES</w:t>
+      </w:r>
+      <w:r>
+        <w:rPr>
+          <w:rFonts w:ascii="Times New Roman" w:hAnsi="Times New Roman" w:eastAsia="Times New Roman"/>
+          <w:b/>
+          <w:sz w:val="24"/>
+        </w:rPr>
+        <w:tab/>
+        <w:t>18</w:t>
+      </w:r>
+    </w:p>
+    <w:p>
+      <w:pPr>
+        <w:tabs>
+          <w:tab w:pos="8640" w:val="right" w:leader="dot"/>
+        </w:tabs>
+        <w:spacing w:line="360" w:lineRule="auto" w:after="0"/>
+        <w:ind w:left="0"/>
+        <w:jc w:val="left"/>
+      </w:pPr>
+      <w:r>
+        <w:rPr>
+          <w:rFonts w:ascii="Times New Roman" w:hAnsi="Times New Roman" w:eastAsia="Times New Roman"/>
+          <w:b/>
+          <w:sz w:val="24"/>
+        </w:rPr>
+        <w:t>APPENDICES</w:t>
+      </w:r>
+      <w:r>
+        <w:rPr>
+          <w:rFonts w:ascii="Times New Roman" w:hAnsi="Times New Roman" w:eastAsia="Times New Roman"/>
+          <w:b/>
+          <w:sz w:val="24"/>
+        </w:rPr>
+        <w:tab/>
+        <w:t>20</w:t>
+      </w:r>
+    </w:p>
+    <w:p>
+      <w:pPr>
+        <w:tabs>
+          <w:tab w:pos="8640" w:val="right" w:leader="dot"/>
+        </w:tabs>
+        <w:spacing w:line="360" w:lineRule="auto" w:after="0"/>
+        <w:ind w:left="432"/>
+        <w:jc w:val="left"/>
+      </w:pPr>
+      <w:r>
+        <w:rPr>
+          <w:rFonts w:ascii="Times New Roman" w:hAnsi="Times New Roman" w:eastAsia="Times New Roman"/>
+          <w:b w:val="0"/>
+          <w:sz w:val="24"/>
+        </w:rPr>
+        <w:t>Appendix A - Research Instruments</w:t>
+      </w:r>
+      <w:r>
+        <w:rPr>
+          <w:rFonts w:ascii="Times New Roman" w:hAnsi="Times New Roman" w:eastAsia="Times New Roman"/>
+          <w:b w:val="0"/>
+          <w:sz w:val="24"/>
+        </w:rPr>
+        <w:tab/>
+        <w:t>20</w:t>
+      </w:r>
+    </w:p>
+    <w:p>
+      <w:pPr>
+        <w:tabs>
+          <w:tab w:pos="8640" w:val="right" w:leader="dot"/>
+        </w:tabs>
+        <w:spacing w:line="360" w:lineRule="auto" w:after="0"/>
+        <w:ind w:left="432"/>
+        <w:jc w:val="left"/>
+      </w:pPr>
+      <w:r>
+        <w:rPr>
+          <w:rFonts w:ascii="Times New Roman" w:hAnsi="Times New Roman" w:eastAsia="Times New Roman"/>
+          <w:b w:val="0"/>
+          <w:sz w:val="24"/>
+        </w:rPr>
+        <w:t>Appendix B - Informed Consent Forms</w:t>
+      </w:r>
+      <w:r>
+        <w:rPr>
+          <w:rFonts w:ascii="Times New Roman" w:hAnsi="Times New Roman" w:eastAsia="Times New Roman"/>
+          <w:b w:val="0"/>
+          <w:sz w:val="24"/>
+        </w:rPr>
+        <w:tab/>
+        <w:t>31</w:t>
+      </w:r>
+    </w:p>
+    <w:p>
+      <w:pPr>
+        <w:spacing w:line="360" w:lineRule="auto" w:after="0"/>
+        <w:jc w:val="both"/>
+      </w:pPr>
+      <w:r>
+        <w:rPr>
+          <w:rFonts w:ascii="Times New Roman" w:hAnsi="Times New Roman" w:eastAsia="Times New Roman"/>
+          <w:i/>
+          <w:sz w:val="24"/>
+        </w:rPr>
+        <w:t>Note: Page numbers are manually listed so the TOC displays immediately in Word and document previewers.</w:t>
       </w:r>
     </w:p>
     <w:p>

</xml_diff>